<commit_message>
feat: publish production onboarding eSign agreements (#13)
* fix(onboarding): publish contract fields at approved coordinates

* fix(onboarding): separate Realty fee signature fields

* feat: publish plan-specific onboarding agreements

* fix: publish clean onboarding esign contracts

* docs: record onboarding production acceptance

---------

Co-authored-by: Novastella <Novastella.nyc@gmail.com>
</commit_message>
<xml_diff>
--- a/contracts/generated/Homix_Living_Team_Leader_Agreement_v2.2-candidate.docx
+++ b/contracts/generated/Homix_Living_Team_Leader_Agreement_v2.2-candidate.docx
@@ -44,7 +44,7 @@
           <w:color w:val="1D1C19"/>
           <w:sz w:val="18"/>
         </w:rPr>
-        <w:t>This Team Leader Agreement supplements Team Leader's completed Agent Affiliation Agreement with Homix Living Inc.. It establishes an internal leadership role, not a separate brokerage, employment relationship, partnership, franchise, ownership interest, or authority to bind Company. The Team and every licensed Team Member must be associated with the same licensed brokerage.</w:t>
+        <w:t>This Team Leader Agreement supplements Team Leader's completed Agent Affiliation Agreement for Homix Living Inc. and establishes an internal leadership role, not a separate brokerage, employment relationship, partnership, franchise, ownership interest, or authority to bind Company. The Team and every licensed Team Member must be associated with the same licensed brokerage.</w:t>
       </w:r>
     </w:p>
     <w:tbl>
@@ -171,7 +171,6 @@
                 <w:color w:val="1D1C19"/>
                 <w:sz w:val="16"/>
               </w:rPr>
-              <w:t>[agent_name]</w:t>
             </w:r>
           </w:p>
         </w:tc>
@@ -208,7 +207,6 @@
                 <w:color w:val="1D1C19"/>
                 <w:sz w:val="16"/>
               </w:rPr>
-              <w:t>[license_number]</w:t>
             </w:r>
           </w:p>
         </w:tc>
@@ -247,7 +245,6 @@
                 <w:color w:val="1D1C19"/>
                 <w:sz w:val="16"/>
               </w:rPr>
-              <w:t>[team_name]</w:t>
             </w:r>
           </w:p>
         </w:tc>
@@ -284,7 +281,6 @@
                 <w:color w:val="1D1C19"/>
                 <w:sz w:val="16"/>
               </w:rPr>
-              <w:t>[expected_member_count]</w:t>
             </w:r>
           </w:p>
         </w:tc>
@@ -323,7 +319,6 @@
                 <w:color w:val="1D1C19"/>
                 <w:sz w:val="16"/>
               </w:rPr>
-              <w:t>[team_positioning]</w:t>
             </w:r>
           </w:p>
         </w:tc>
@@ -360,7 +355,6 @@
                 <w:color w:val="1D1C19"/>
                 <w:sz w:val="16"/>
               </w:rPr>
-              <w:t>[compensation_plan]</w:t>
             </w:r>
           </w:p>
         </w:tc>
@@ -485,7 +479,7 @@
           <w:color w:val="1D1C19"/>
           <w:sz w:val="18"/>
         </w:rPr>
-        <w:t>Team Leader personal-production plan (read-only): [compensation_plan]</w:t>
+        <w:t xml:space="preserve">Team Leader personal-production plan (read-only): </w:t>
       </w:r>
     </w:p>
     <w:tbl>
@@ -536,7 +530,6 @@
                 <w:color w:val="1D1C19"/>
                 <w:sz w:val="16"/>
               </w:rPr>
-              <w:t>[team_name]</w:t>
             </w:r>
           </w:p>
         </w:tc>
@@ -573,7 +566,6 @@
                 <w:color w:val="1D1C19"/>
                 <w:sz w:val="16"/>
               </w:rPr>
-              <w:t>[team_terms_effective_from]</w:t>
             </w:r>
           </w:p>
         </w:tc>
@@ -612,7 +604,6 @@
                 <w:color w:val="1D1C19"/>
                 <w:sz w:val="16"/>
               </w:rPr>
-              <w:t>[team_split_pct]% of Agent Side</w:t>
             </w:r>
           </w:p>
         </w:tc>
@@ -649,7 +640,6 @@
                 <w:color w:val="1D1C19"/>
                 <w:sz w:val="16"/>
               </w:rPr>
-              <w:t>[team_sourced_split_pct]% of Agent Side</w:t>
             </w:r>
           </w:p>
         </w:tc>
@@ -688,7 +678,6 @@
                 <w:color w:val="1D1C19"/>
                 <w:sz w:val="16"/>
               </w:rPr>
-              <w:t>[team_cap_usd]</w:t>
             </w:r>
           </w:p>
         </w:tc>
@@ -725,7 +714,6 @@
                 <w:color w:val="1D1C19"/>
                 <w:sz w:val="16"/>
               </w:rPr>
-              <w:t>[team_config_version]</w:t>
             </w:r>
           </w:p>
         </w:tc>
@@ -1609,7 +1597,6 @@
                 <w:color w:val="1D1C19"/>
                 <w:sz w:val="16"/>
               </w:rPr>
-              <w:t>[agent_name]</w:t>
             </w:r>
           </w:p>
         </w:tc>
@@ -1646,7 +1633,6 @@
                 <w:color w:val="1D1C19"/>
                 <w:sz w:val="16"/>
               </w:rPr>
-              <w:t>[license_number]</w:t>
             </w:r>
           </w:p>
         </w:tc>
@@ -1685,7 +1671,6 @@
                 <w:color w:val="1D1C19"/>
                 <w:sz w:val="16"/>
               </w:rPr>
-              <w:t>[team_name]</w:t>
             </w:r>
           </w:p>
         </w:tc>
@@ -1722,7 +1707,6 @@
                 <w:color w:val="1D1C19"/>
                 <w:sz w:val="16"/>
               </w:rPr>
-              <w:t>[team_config_version]</w:t>
             </w:r>
           </w:p>
         </w:tc>

</xml_diff>